<commit_message>
Corrección - Actividad 4
</commit_message>
<xml_diff>
--- a/Ejercicios/Clase 2/Actividad4.docx
+++ b/Ejercicios/Clase 2/Actividad4.docx
@@ -275,46 +275,30 @@
           <w:bCs/>
           <w:lang w:val="es-CR"/>
         </w:rPr>
-        <w:t>imagen-somos-u-publica.jpg</w:t>
-      </w:r>
-      <w:r>
-        <w:rPr>
-          <w:lang w:val="es-CR"/>
-        </w:rPr>
-        <w:t xml:space="preserve"> con 1,124 kB (1.1 MB), de tipo JPEG. Sí podría optimizarse de varias formas:</w:t>
+        <w:t>actividades-bg.png</w:t>
+      </w:r>
+      <w:r>
+        <w:rPr>
+          <w:lang w:val="es-CR"/>
+        </w:rPr>
+        <w:t xml:space="preserve"> con 1,572 kB (1.53 MB), de tipo PNG.</w:t>
       </w:r>
     </w:p>
     <w:p>
       <w:pPr>
         <w:rPr>
-          <w:lang w:val="es-CR"/>
-        </w:rPr>
-      </w:pPr>
-      <w:r>
-        <w:rPr>
-          <w:lang w:val="es-CR"/>
-        </w:rPr>
-        <w:t xml:space="preserve">Convertir a </w:t>
-      </w:r>
-      <w:proofErr w:type="spellStart"/>
-      <w:r>
-        <w:rPr>
-          <w:lang w:val="es-CR"/>
-        </w:rPr>
-        <w:t>WebP</w:t>
-      </w:r>
-      <w:proofErr w:type="spellEnd"/>
-      <w:r>
-        <w:rPr>
-          <w:lang w:val="es-CR"/>
-        </w:rPr>
-        <w:t xml:space="preserve"> -</w:t>
-      </w:r>
-      <w:r>
-        <w:rPr>
-          <w:lang w:val="es-CR"/>
-        </w:rPr>
-        <w:t xml:space="preserve"> reduce el tamaño hasta un 40% con calidad visual similar</w:t>
+          <w:i/>
+          <w:iCs/>
+          <w:lang w:val="es-CR"/>
+        </w:rPr>
+      </w:pPr>
+      <w:r>
+        <w:rPr>
+          <w:i/>
+          <w:iCs/>
+          <w:lang w:val="es-CR"/>
+        </w:rPr>
+        <w:t>¿Podría optimizarse?</w:t>
       </w:r>
     </w:p>
     <w:p>
@@ -327,80 +311,142 @@
         <w:rPr>
           <w:lang w:val="es-CR"/>
         </w:rPr>
-        <w:t xml:space="preserve">Aplicar </w:t>
-      </w:r>
-      <w:proofErr w:type="spellStart"/>
-      <w:r>
-        <w:rPr>
-          <w:lang w:val="es-CR"/>
-        </w:rPr>
-        <w:t>lazy</w:t>
-      </w:r>
-      <w:proofErr w:type="spellEnd"/>
-      <w:r>
-        <w:rPr>
-          <w:lang w:val="es-CR"/>
-        </w:rPr>
-        <w:t xml:space="preserve"> </w:t>
-      </w:r>
-      <w:proofErr w:type="spellStart"/>
-      <w:r>
-        <w:rPr>
-          <w:lang w:val="es-CR"/>
-        </w:rPr>
-        <w:t>loading</w:t>
-      </w:r>
-      <w:proofErr w:type="spellEnd"/>
-      <w:r>
-        <w:rPr>
-          <w:lang w:val="es-CR"/>
-        </w:rPr>
-        <w:t xml:space="preserve"> </w:t>
-      </w:r>
-      <w:r>
-        <w:rPr>
-          <w:lang w:val="es-CR"/>
-        </w:rPr>
-        <w:t xml:space="preserve">- </w:t>
-      </w:r>
-      <w:r>
-        <w:rPr>
-          <w:lang w:val="es-CR"/>
-        </w:rPr>
-        <w:t>cargarla solo cuando el usuario llega a esa sección</w:t>
+        <w:t>Sí, y es un caso crítico porque es una imagen de fondo:</w:t>
       </w:r>
     </w:p>
     <w:p>
       <w:pPr>
-        <w:rPr>
-          <w:lang w:val="es-CR"/>
-        </w:rPr>
-      </w:pPr>
-      <w:r>
-        <w:rPr>
-          <w:lang w:val="es-CR"/>
-        </w:rPr>
-        <w:t xml:space="preserve">Redimensionar </w:t>
-      </w:r>
-      <w:r>
-        <w:rPr>
-          <w:lang w:val="es-CR"/>
-        </w:rPr>
-        <w:t>-</w:t>
-      </w:r>
-      <w:r>
-        <w:rPr>
-          <w:lang w:val="es-CR"/>
-        </w:rPr>
-        <w:t xml:space="preserve"> servir el tamaño exacto que necesita el navegador, no la imagen original de alta resolución</w:t>
+        <w:pStyle w:val="ListParagraph"/>
+        <w:numPr>
+          <w:ilvl w:val="0"/>
+          <w:numId w:val="2"/>
+        </w:numPr>
+        <w:rPr>
+          <w:lang w:val="es-CR"/>
+        </w:rPr>
+      </w:pPr>
+      <w:r>
+        <w:rPr>
+          <w:lang w:val="es-CR"/>
+        </w:rPr>
+        <w:t xml:space="preserve">Convertir a </w:t>
+      </w:r>
+      <w:proofErr w:type="spellStart"/>
+      <w:r>
+        <w:rPr>
+          <w:lang w:val="es-CR"/>
+        </w:rPr>
+        <w:t>WebP</w:t>
+      </w:r>
+      <w:proofErr w:type="spellEnd"/>
+      <w:r>
+        <w:rPr>
+          <w:lang w:val="es-CR"/>
+        </w:rPr>
+        <w:t xml:space="preserve"> → reduce hasta 40-50% manteniendo calidad, especialmente en PNG</w:t>
       </w:r>
     </w:p>
     <w:p>
       <w:pPr>
-        <w:rPr>
-          <w:lang w:val="es-CR"/>
-        </w:rPr>
-      </w:pPr>
+        <w:pStyle w:val="ListParagraph"/>
+        <w:numPr>
+          <w:ilvl w:val="0"/>
+          <w:numId w:val="2"/>
+        </w:numPr>
+        <w:rPr>
+          <w:lang w:val="es-CR"/>
+        </w:rPr>
+      </w:pPr>
+      <w:r>
+        <w:rPr>
+          <w:lang w:val="es-CR"/>
+        </w:rPr>
+        <w:t>Si es una imagen de fondo decorativa, convertir a JPEG → aún menor tamaño</w:t>
+      </w:r>
+    </w:p>
+    <w:p>
+      <w:pPr>
+        <w:pStyle w:val="ListParagraph"/>
+        <w:numPr>
+          <w:ilvl w:val="0"/>
+          <w:numId w:val="2"/>
+        </w:numPr>
+        <w:rPr>
+          <w:lang w:val="es-CR"/>
+        </w:rPr>
+      </w:pPr>
+      <w:r>
+        <w:rPr>
+          <w:lang w:val="es-CR"/>
+        </w:rPr>
+        <w:t xml:space="preserve">Aplicar compresión sin pérdida con herramientas como </w:t>
+      </w:r>
+      <w:proofErr w:type="spellStart"/>
+      <w:r>
+        <w:rPr>
+          <w:lang w:val="es-CR"/>
+        </w:rPr>
+        <w:t>TinyPNG</w:t>
+      </w:r>
+      <w:proofErr w:type="spellEnd"/>
+    </w:p>
+    <w:p>
+      <w:pPr>
+        <w:pStyle w:val="ListParagraph"/>
+        <w:numPr>
+          <w:ilvl w:val="0"/>
+          <w:numId w:val="2"/>
+        </w:numPr>
+        <w:rPr>
+          <w:lang w:val="es-CR"/>
+        </w:rPr>
+      </w:pPr>
+      <w:r>
+        <w:rPr>
+          <w:lang w:val="es-CR"/>
+        </w:rPr>
+        <w:t>Usar CSS para efectos de fondo simples en vez de imagen pesada</w:t>
+      </w:r>
+    </w:p>
+    <w:p>
+      <w:pPr>
+        <w:pStyle w:val="ListParagraph"/>
+        <w:numPr>
+          <w:ilvl w:val="0"/>
+          <w:numId w:val="2"/>
+        </w:numPr>
+        <w:rPr>
+          <w:lang w:val="es-CR"/>
+        </w:rPr>
+      </w:pPr>
+      <w:proofErr w:type="spellStart"/>
+      <w:r>
+        <w:rPr>
+          <w:lang w:val="es-CR"/>
+        </w:rPr>
+        <w:t>Lazy</w:t>
+      </w:r>
+      <w:proofErr w:type="spellEnd"/>
+      <w:r>
+        <w:rPr>
+          <w:lang w:val="es-CR"/>
+        </w:rPr>
+        <w:t xml:space="preserve"> </w:t>
+      </w:r>
+      <w:proofErr w:type="spellStart"/>
+      <w:r>
+        <w:rPr>
+          <w:lang w:val="es-CR"/>
+        </w:rPr>
+        <w:t>loading</w:t>
+      </w:r>
+      <w:proofErr w:type="spellEnd"/>
+      <w:r>
+        <w:rPr>
+          <w:lang w:val="es-CR"/>
+        </w:rPr>
+        <w:t xml:space="preserve"> → si está al final de la página, no cargarla hasta que el usuario llegue ahí</w:t>
+      </w:r>
     </w:p>
     <w:sectPr>
       <w:pgSz w:w="12240" w:h="15840"/>
@@ -563,8 +609,124 @@
       </w:rPr>
     </w:lvl>
   </w:abstractNum>
+  <w:abstractNum w:abstractNumId="1" w15:restartNumberingAfterBreak="0">
+    <w:nsid w:val="728701CB"/>
+    <w:multiLevelType w:val="hybridMultilevel"/>
+    <w:tmpl w:val="02027FD4"/>
+    <w:lvl w:ilvl="0" w:tplc="04090001">
+      <w:start w:val="1"/>
+      <w:numFmt w:val="bullet"/>
+      <w:lvlText w:val=""/>
+      <w:lvlJc w:val="left"/>
+      <w:pPr>
+        <w:ind w:left="720" w:hanging="360"/>
+      </w:pPr>
+      <w:rPr>
+        <w:rFonts w:ascii="Symbol" w:hAnsi="Symbol" w:hint="default"/>
+      </w:rPr>
+    </w:lvl>
+    <w:lvl w:ilvl="1" w:tplc="04090003" w:tentative="1">
+      <w:start w:val="1"/>
+      <w:numFmt w:val="bullet"/>
+      <w:lvlText w:val="o"/>
+      <w:lvlJc w:val="left"/>
+      <w:pPr>
+        <w:ind w:left="1440" w:hanging="360"/>
+      </w:pPr>
+      <w:rPr>
+        <w:rFonts w:ascii="Courier New" w:hAnsi="Courier New" w:cs="Courier New" w:hint="default"/>
+      </w:rPr>
+    </w:lvl>
+    <w:lvl w:ilvl="2" w:tplc="04090005" w:tentative="1">
+      <w:start w:val="1"/>
+      <w:numFmt w:val="bullet"/>
+      <w:lvlText w:val=""/>
+      <w:lvlJc w:val="left"/>
+      <w:pPr>
+        <w:ind w:left="2160" w:hanging="360"/>
+      </w:pPr>
+      <w:rPr>
+        <w:rFonts w:ascii="Wingdings" w:hAnsi="Wingdings" w:hint="default"/>
+      </w:rPr>
+    </w:lvl>
+    <w:lvl w:ilvl="3" w:tplc="04090001" w:tentative="1">
+      <w:start w:val="1"/>
+      <w:numFmt w:val="bullet"/>
+      <w:lvlText w:val=""/>
+      <w:lvlJc w:val="left"/>
+      <w:pPr>
+        <w:ind w:left="2880" w:hanging="360"/>
+      </w:pPr>
+      <w:rPr>
+        <w:rFonts w:ascii="Symbol" w:hAnsi="Symbol" w:hint="default"/>
+      </w:rPr>
+    </w:lvl>
+    <w:lvl w:ilvl="4" w:tplc="04090003" w:tentative="1">
+      <w:start w:val="1"/>
+      <w:numFmt w:val="bullet"/>
+      <w:lvlText w:val="o"/>
+      <w:lvlJc w:val="left"/>
+      <w:pPr>
+        <w:ind w:left="3600" w:hanging="360"/>
+      </w:pPr>
+      <w:rPr>
+        <w:rFonts w:ascii="Courier New" w:hAnsi="Courier New" w:cs="Courier New" w:hint="default"/>
+      </w:rPr>
+    </w:lvl>
+    <w:lvl w:ilvl="5" w:tplc="04090005" w:tentative="1">
+      <w:start w:val="1"/>
+      <w:numFmt w:val="bullet"/>
+      <w:lvlText w:val=""/>
+      <w:lvlJc w:val="left"/>
+      <w:pPr>
+        <w:ind w:left="4320" w:hanging="360"/>
+      </w:pPr>
+      <w:rPr>
+        <w:rFonts w:ascii="Wingdings" w:hAnsi="Wingdings" w:hint="default"/>
+      </w:rPr>
+    </w:lvl>
+    <w:lvl w:ilvl="6" w:tplc="04090001" w:tentative="1">
+      <w:start w:val="1"/>
+      <w:numFmt w:val="bullet"/>
+      <w:lvlText w:val=""/>
+      <w:lvlJc w:val="left"/>
+      <w:pPr>
+        <w:ind w:left="5040" w:hanging="360"/>
+      </w:pPr>
+      <w:rPr>
+        <w:rFonts w:ascii="Symbol" w:hAnsi="Symbol" w:hint="default"/>
+      </w:rPr>
+    </w:lvl>
+    <w:lvl w:ilvl="7" w:tplc="04090003" w:tentative="1">
+      <w:start w:val="1"/>
+      <w:numFmt w:val="bullet"/>
+      <w:lvlText w:val="o"/>
+      <w:lvlJc w:val="left"/>
+      <w:pPr>
+        <w:ind w:left="5760" w:hanging="360"/>
+      </w:pPr>
+      <w:rPr>
+        <w:rFonts w:ascii="Courier New" w:hAnsi="Courier New" w:cs="Courier New" w:hint="default"/>
+      </w:rPr>
+    </w:lvl>
+    <w:lvl w:ilvl="8" w:tplc="04090005" w:tentative="1">
+      <w:start w:val="1"/>
+      <w:numFmt w:val="bullet"/>
+      <w:lvlText w:val=""/>
+      <w:lvlJc w:val="left"/>
+      <w:pPr>
+        <w:ind w:left="6480" w:hanging="360"/>
+      </w:pPr>
+      <w:rPr>
+        <w:rFonts w:ascii="Wingdings" w:hAnsi="Wingdings" w:hint="default"/>
+      </w:rPr>
+    </w:lvl>
+  </w:abstractNum>
   <w:num w:numId="1" w16cid:durableId="442698075">
     <w:abstractNumId w:val="0"/>
+  </w:num>
+  <w:num w:numId="2" w16cid:durableId="550503052">
+    <w:abstractNumId w:val="1"/>
   </w:num>
 </w:numbering>
 </file>
@@ -1172,6 +1334,7 @@
   <w:style w:type="character" w:default="1" w:styleId="DefaultParagraphFont">
     <w:name w:val="Default Paragraph Font"/>
     <w:uiPriority w:val="1"/>
+    <w:semiHidden/>
     <w:unhideWhenUsed/>
   </w:style>
   <w:style w:type="table" w:default="1" w:styleId="TableNormal">

</xml_diff>